<commit_message>
[scholar] GEB 7365 final: Figure 2 study model, data sources/software/timeframe paragraph, disclosure updated; 30 pages
Co-Authored-By: Claude Opus 5.5 <noreply@anthropic.com>
Claude-Session: https://claude.ai/code/session_019uQWfMoV11me5yJ6LYRtPv
</commit_message>
<xml_diff>
--- a/dba/coursework/GEB7365_International_Business/Malik_GEB7365_ProjectReport_FINAL.docx
+++ b/dba/coursework/GEB7365_International_Business/Malik_GEB7365_ProjectReport_FINAL.docx
@@ -1144,6 +1144,34 @@
           <w:sz w:val="24"/>
         </w:rPr>
         <w:t>No data have been collected for this project. The design above is what the project proposes, and the preliminary evidence reported in the next section comes from the author's prior study and from published response rates, not from fieldwork conducted for this paper.</w:t>
+      </w:r>
+    </w:p>
+    <w:p>
+      <w:pPr>
+        <w:pStyle w:val="Heading2"/>
+      </w:pPr>
+      <w:r>
+        <w:rPr>
+          <w:rFonts w:ascii="Times New Roman" w:hAnsi="Times New Roman" w:cs="Times New Roman" w:eastAsia="Times New Roman"/>
+          <w:b/>
+          <w:color w:val="000000"/>
+          <w:sz w:val="26"/>
+        </w:rPr>
+        <w:t>Data sources, analysis software and timeframe</w:t>
+      </w:r>
+    </w:p>
+    <w:p>
+      <w:pPr>
+        <w:spacing w:line="480" w:lineRule="auto" w:after="160"/>
+        <w:jc w:val="both"/>
+      </w:pPr>
+      <w:r>
+        <w:rPr>
+          <w:rFonts w:ascii="Times New Roman" w:hAnsi="Times New Roman" w:cs="Times New Roman" w:eastAsia="Times New Roman"/>
+          <w:color w:val="000000"/>
+          <w:sz w:val="24"/>
+        </w:rPr>
+        <w:t>Figure 2 brings the five hypotheses together in one model. The data come from two sources. The first is the audience-configuration estimates that commercial panel providers return for each occupation, country and provider cell, which supply the dependent variable for H1, H2 and H4 before any fieldwork is commissioned. The second is a coded sample of published cross-national survey studies in international business journals, which supplies achieved coverage and response for H3, H4 and H5, alongside the response-rate evidence reported by Harzing, Reiche and Pudelko (2013). The sensitivity analysis for H1 is run in Python, and the multilevel and cross-classified models for H2, H4 and H5 in R using the lme4 package. The study is planned over about twelve months: quotes collected across the cell matrix in months one to three, the published studies coded in months two to six, models estimated in months seven to nine, and the paper written in months ten to twelve.</w:t>
       </w:r>
     </w:p>
     <w:p>
@@ -3591,7 +3619,7 @@
       <w:r>
         <w:drawing>
           <wp:inline xmlns:a="http://schemas.openxmlformats.org/drawingml/2006/main" xmlns:pic="http://schemas.openxmlformats.org/drawingml/2006/picture">
-            <wp:extent cx="5760720" cy="3665913"/>
+            <wp:extent cx="5120640" cy="3258589"/>
             <wp:docPr id="1" name="Picture 1" descr="Combination bar and line chart. Blue bars show the panel members required in every national frame to yield 30 usable responses, rising from 18.8 million for a design covering Spain alone to 72.2 million for a design covering Spain, Germany, Japan, the United Kingdom and China. An orange line shows the binding response rate falling from 15.4 percent to 4.0 percent as countries are added. A grey line shows the mean response rate falling only from 15.4 percent to 9.2 percent over the same designs. The gap between the two lines is the point of the figure: the mean barely moves while the requirement quadruples, because the design is priced by its worst frame." title="Combination bar and line chart. Blue bars show the panel members required in every national frame to yield 30 usable responses, rising from 18.8 million for a design covering Spain alone to 72.2 million for a design covering Spain, Germany, Japan, the Uni"/>
             <wp:cNvGraphicFramePr>
               <a:graphicFrameLocks noChangeAspect="1"/>
@@ -3612,7 +3640,7 @@
                   <pic:spPr>
                     <a:xfrm>
                       <a:off x="0" y="0"/>
-                      <a:ext cx="5760720" cy="3665913"/>
+                      <a:ext cx="5120640" cy="3258589"/>
                     </a:xfrm>
                     <a:prstGeom prst="rect"/>
                   </pic:spPr>
@@ -3640,6 +3668,76 @@
     </w:p>
     <w:p>
       <w:pPr>
+        <w:pStyle w:val="Heading2"/>
+        <w:spacing w:line="240" w:lineRule="auto" w:after="120"/>
+      </w:pPr>
+      <w:r>
+        <w:rPr>
+          <w:rFonts w:ascii="Times New Roman" w:hAnsi="Times New Roman" w:cs="Times New Roman" w:eastAsia="Times New Roman"/>
+          <w:b/>
+          <w:color w:val="000000"/>
+          <w:sz w:val="26"/>
+        </w:rPr>
+        <w:t>Figure 2. The study model: five hypotheses</w:t>
+      </w:r>
+    </w:p>
+    <w:p>
+      <w:pPr>
+        <w:spacing w:line="240" w:lineRule="auto" w:after="120"/>
+        <w:jc w:val="center"/>
+      </w:pPr>
+      <w:r>
+        <w:drawing>
+          <wp:inline xmlns:a="http://schemas.openxmlformats.org/drawingml/2006/main" xmlns:pic="http://schemas.openxmlformats.org/drawingml/2006/picture">
+            <wp:extent cx="5120640" cy="2944368"/>
+            <wp:docPr id="2" name="Picture 2" descr="Model diagram. Three inputs on the left, region concordance (H2, positive), data-collection mode (H4) and instrument standardization (H5, negative, moderated by baseline response), point to the dependent variable in the centre, reachable usable sample per cell and achieved response. Two outcomes on the right follow from it: joint feasibility, set by the least feasible frame (H1, analytic), and the regionally concentrated coverage of studies described as cross-national (H3). A top band gives the levels of analysis and a bottom band lists the controls." title="Model diagram. Three inputs on the left, region concordance (H2, positive), data-collection mode (H4) and instrument standardization (H5, negative, moderated by baseline response), point to the dependent variable in the centre, reachable usable sample per"/>
+            <wp:cNvGraphicFramePr>
+              <a:graphicFrameLocks noChangeAspect="1"/>
+            </wp:cNvGraphicFramePr>
+            <a:graphic>
+              <a:graphicData uri="http://schemas.openxmlformats.org/drawingml/2006/picture">
+                <pic:pic>
+                  <pic:nvPicPr>
+                    <pic:cNvPr id="0" name="fig2_study_model.png"/>
+                    <pic:cNvPicPr/>
+                  </pic:nvPicPr>
+                  <pic:blipFill>
+                    <a:blip r:embed="rId10"/>
+                    <a:stretch>
+                      <a:fillRect/>
+                    </a:stretch>
+                  </pic:blipFill>
+                  <pic:spPr>
+                    <a:xfrm>
+                      <a:off x="0" y="0"/>
+                      <a:ext cx="5120640" cy="2944368"/>
+                    </a:xfrm>
+                    <a:prstGeom prst="rect"/>
+                  </pic:spPr>
+                </pic:pic>
+              </a:graphicData>
+            </a:graphic>
+          </wp:inline>
+        </w:drawing>
+      </w:r>
+    </w:p>
+    <w:p>
+      <w:pPr>
+        <w:spacing w:after="120" w:line="240" w:lineRule="auto"/>
+        <w:jc w:val="center"/>
+      </w:pPr>
+      <w:r>
+        <w:rPr>
+          <w:rFonts w:ascii="Times New Roman" w:hAnsi="Times New Roman" w:cs="Times New Roman" w:eastAsia="Times New Roman"/>
+          <w:i/>
+          <w:color w:val="000000"/>
+          <w:sz w:val="21"/>
+        </w:rPr>
+        <w:t>Figure 2. The five hypotheses in one model. Prepared with AI assistance for layout from the author's hypotheses.</w:t>
+      </w:r>
+    </w:p>
+    <w:p>
+      <w:pPr>
         <w:pStyle w:val="Heading1"/>
       </w:pPr>
       <w:r>
@@ -3654,7 +3752,7 @@
     </w:p>
     <w:p>
       <w:pPr>
-        <w:spacing w:line="480" w:lineRule="auto" w:after="160"/>
+        <w:spacing w:line="240" w:lineRule="auto" w:after="120"/>
         <w:jc w:val="both"/>
       </w:pPr>
       <w:r>
@@ -3663,7 +3761,7 @@
           <w:color w:val="000000"/>
           <w:sz w:val="24"/>
         </w:rPr>
-        <w:t>Generative artificial intelligence (Claude, Anthropic) was used to organise this paper, to format it to the required structure, to produce Figure 1 from the author's own model code, and to check the prose for clarity and grammar. The research question, the theoretical argument, the hypotheses and their justification, and the interpretation of the empirical inputs are the author's own. The figures reported derive from the author's own study records and from published sources cited in the text. In the revision that followed the instructor's written comments of 28 September 2026, it was also used to organise the response to each comment and to locate candidate sources; every citation added in that revision was checked against a publisher or index record before inclusion. Passages added in that revision, notably the section on Latin America and the literature added to each hypothesis, were first drafted with AI assistance and then revised by the author. No confidential, identifiable, or restricted data was provided to any artificial intelligence system. This disclosure is made in accordance with the FIU University Graduate School policy on artificial intelligence use and the course syllabus.</w:t>
+        <w:t>Generative artificial intelligence (Claude, Anthropic) was used to organise this paper, to format it to the required structure, to produce Figure 1 from the author's own model code and lay out Figure 2 from the author's hypotheses, to draft the paragraph on data sources, software and timeframe from the author's design, and to check the prose for clarity and grammar. The research question, the theoretical argument, the hypotheses and their justification, and the interpretation of the empirical inputs are the author's own. The figures reported derive from the author's own study records and from published sources cited in the text. In the revision that followed the instructor's written comments of 28 September 2026, it was also used to organise the response to each comment and to locate candidate sources; every citation added in that revision was checked against a publisher or index record before inclusion. Passages added in that revision, notably the section on Latin America and the literature added to each hypothesis, were first drafted with AI assistance and then revised by the author. No confidential, identifiable, or restricted data was provided to any artificial intelligence system. This disclosure is made in accordance with the FIU University Graduate School policy on artificial intelligence use and the course syllabus.</w:t>
       </w:r>
     </w:p>
     <w:sectPr>

</xml_diff>

<commit_message>
[scholar] GEB 7365 final: placeholders replaced with references to the end section; SPSS + Python; Figure 2 caption trimmed
Co-Authored-By: Claude Opus 5.5 <noreply@anthropic.com>
Claude-Session: https://claude.ai/code/session_019uQWfMoV11me5yJ6LYRtPv
</commit_message>
<xml_diff>
--- a/dba/coursework/GEB7365_International_Business/Malik_GEB7365_ProjectReport_FINAL.docx
+++ b/dba/coursework/GEB7365_International_Business/Malik_GEB7365_ProjectReport_FINAL.docx
@@ -617,35 +617,7 @@
           <w:color w:val="000000"/>
           <w:sz w:val="24"/>
         </w:rPr>
-        <w:t>Insert Table 1 About Here</w:t>
-      </w:r>
-    </w:p>
-    <w:p>
-      <w:pPr>
-        <w:spacing w:line="480" w:lineRule="auto" w:after="160"/>
-        <w:jc w:val="both"/>
-      </w:pPr>
-      <w:r>
-        <w:rPr>
-          <w:rFonts w:ascii="Times New Roman" w:hAnsi="Times New Roman" w:cs="Times New Roman" w:eastAsia="Times New Roman"/>
-          <w:color w:val="000000"/>
-          <w:sz w:val="24"/>
-        </w:rPr>
-        <w:t>Insert Table 2 About Here</w:t>
-      </w:r>
-    </w:p>
-    <w:p>
-      <w:pPr>
-        <w:spacing w:line="480" w:lineRule="auto" w:after="160"/>
-        <w:jc w:val="both"/>
-      </w:pPr>
-      <w:r>
-        <w:rPr>
-          <w:rFonts w:ascii="Times New Roman" w:hAnsi="Times New Roman" w:cs="Times New Roman" w:eastAsia="Times New Roman"/>
-          <w:color w:val="000000"/>
-          <w:sz w:val="24"/>
-        </w:rPr>
-        <w:t>Insert Figure 1 About Here</w:t>
+        <w:t>Tables 1 and 2 and Figure 1, in the Tables and Figures section at the end of the paper, set out the arithmetic behind H1.</w:t>
       </w:r>
     </w:p>
     <w:p>
@@ -961,7 +933,7 @@
           <w:color w:val="000000"/>
           <w:sz w:val="24"/>
         </w:rPr>
-        <w:t>Insert Table 3 About Here</w:t>
+        <w:t>Table 3, in the Tables and Figures section, summarizes each hypothesis, its theoretical source and its test; Figure 2 shows all five together.</w:t>
       </w:r>
     </w:p>
     <w:p>
@@ -1171,7 +1143,7 @@
           <w:color w:val="000000"/>
           <w:sz w:val="24"/>
         </w:rPr>
-        <w:t>Figure 2 brings the five hypotheses together in one model. The data come from two sources. The first is the audience-configuration estimates that commercial panel providers return for each occupation, country and provider cell, which supply the dependent variable for H1, H2 and H4 before any fieldwork is commissioned. The second is a coded sample of published cross-national survey studies in international business journals, which supplies achieved coverage and response for H3, H4 and H5, alongside the response-rate evidence reported by Harzing, Reiche and Pudelko (2013). The sensitivity analysis for H1 is run in Python, and the multilevel and cross-classified models for H2, H4 and H5 in R using the lme4 package. The study is planned over about twelve months: quotes collected across the cell matrix in months one to three, the published studies coded in months two to six, models estimated in months seven to nine, and the paper written in months ten to twelve.</w:t>
+        <w:t>Figure 2 brings the five hypotheses together in one model. The data come from two sources. The first is the audience-configuration estimates that commercial panel providers return for each occupation, country and provider cell, which supply the dependent variable for H1, H2 and H4 before any fieldwork is commissioned. The second is a coded sample of published cross-national survey studies in international business journals, which supplies achieved coverage and response for H3, H4 and H5, alongside the response-rate evidence reported by Harzing, Reiche and Pudelko (2013). The sensitivity analysis for H1 is run in Python, and the multilevel and cross-classified models for H2, H4 and H5 in SPSS using the MIXED procedure. The study is planned over about twelve months: quotes collected across the cell matrix in months one to three, the published studies coded in months two to six, models estimated in months seven to nine, and the paper written in months ten to twelve.</w:t>
       </w:r>
     </w:p>
     <w:p>
@@ -3733,7 +3705,7 @@
           <w:color w:val="000000"/>
           <w:sz w:val="21"/>
         </w:rPr>
-        <w:t>Figure 2. The five hypotheses in one model. Prepared with AI assistance for layout from the author's hypotheses.</w:t>
+        <w:t>Figure 2. The five hypotheses in one model.</w:t>
       </w:r>
     </w:p>
     <w:p>

</xml_diff>